<commit_message>
Alle beschikbare video's toegevoegd, testplan code en GUI locaties aangepast, en GUI toegevoegd
</commit_message>
<xml_diff>
--- a/Opleverset/Documentatie/Tests/Testplan.docx
+++ b/Opleverset/Documentatie/Tests/Testplan.docx
@@ -583,15 +583,7 @@
       </w:r>
       <w:r>
         <w:br/>
-        <w:t xml:space="preserve">- </w:t>
-      </w:r>
-      <w:proofErr w:type="spellStart"/>
-      <w:r>
-        <w:t>Floating</w:t>
-      </w:r>
-      <w:proofErr w:type="spellEnd"/>
-      <w:r>
-        <w:t xml:space="preserve"> Farm schaalmodel (zonder elektronica) (</w:t>
+        <w:t>- Floating Farm schaalmodel (zonder elektronica) (</w:t>
       </w:r>
       <w:r>
         <w:rPr>
@@ -862,15 +854,7 @@
         <w:t xml:space="preserve"> het nulpunt </w:t>
       </w:r>
       <w:r>
-        <w:t xml:space="preserve">niet beïnvloed worden door de schommelingen van de </w:t>
-      </w:r>
-      <w:proofErr w:type="spellStart"/>
-      <w:r>
-        <w:t>Floating</w:t>
-      </w:r>
-      <w:proofErr w:type="spellEnd"/>
-      <w:r>
-        <w:t xml:space="preserve"> Farm en de eventuele verschillende startposities van de boerderij. </w:t>
+        <w:t xml:space="preserve">niet beïnvloed worden door de schommelingen van de Floating Farm en de eventuele verschillende startposities van de boerderij. </w:t>
       </w:r>
     </w:p>
     <w:p>
@@ -887,13 +871,8 @@
       </w:r>
       <w:r>
         <w:br/>
-        <w:t xml:space="preserve">- MPU-6050 </w:t>
-      </w:r>
-      <w:proofErr w:type="spellStart"/>
-      <w:r>
-        <w:t>accelerometer</w:t>
-      </w:r>
-      <w:proofErr w:type="spellEnd"/>
+        <w:t>- MPU-6050 accelerometer</w:t>
+      </w:r>
       <w:r>
         <w:br/>
         <w:t xml:space="preserve">- </w:t>
@@ -903,15 +882,7 @@
       </w:r>
       <w:r>
         <w:br/>
-        <w:t xml:space="preserve">- Laptop om code up te </w:t>
-      </w:r>
-      <w:proofErr w:type="spellStart"/>
-      <w:r>
-        <w:t>loaden</w:t>
-      </w:r>
-      <w:proofErr w:type="spellEnd"/>
-      <w:r>
-        <w:t xml:space="preserve"> en data binnen te krijgen</w:t>
+        <w:t>- Laptop om code up te loaden en data binnen te krijgen</w:t>
       </w:r>
       <w:r>
         <w:br/>
@@ -921,56 +892,44 @@
         <w:rPr>
           <w:color w:val="00B0F0"/>
         </w:rPr>
-        <w:t>Project-5-6---</w:t>
-      </w:r>
-      <w:proofErr w:type="spellStart"/>
+        <w:t>Project-5-6---Floating-Farm\Opleverset\Code\ESP32\</w:t>
+      </w:r>
       <w:r>
         <w:rPr>
           <w:color w:val="00B0F0"/>
         </w:rPr>
-        <w:t>Floating</w:t>
-      </w:r>
-      <w:proofErr w:type="spellEnd"/>
+        <w:t>test\</w:t>
+      </w:r>
       <w:r>
         <w:rPr>
           <w:color w:val="00B0F0"/>
         </w:rPr>
-        <w:t>-Farm\</w:t>
-      </w:r>
-      <w:proofErr w:type="spellStart"/>
+        <w:t>Accelerometer_Code_V1</w:t>
+      </w:r>
       <w:r>
         <w:rPr>
           <w:color w:val="00B0F0"/>
         </w:rPr>
-        <w:t>Opleverset</w:t>
-      </w:r>
-      <w:proofErr w:type="spellEnd"/>
+        <w:t>\</w:t>
+      </w:r>
       <w:r>
         <w:rPr>
           <w:color w:val="00B0F0"/>
         </w:rPr>
-        <w:t>\Code\ESP32\</w:t>
+        <w:t>Accelerometer_Code_V1</w:t>
       </w:r>
       <w:r>
         <w:rPr>
           <w:color w:val="00B0F0"/>
         </w:rPr>
-        <w:t>...</w:t>
+        <w:t>.ino</w:t>
       </w:r>
       <w:r>
         <w:t>)</w:t>
       </w:r>
       <w:r>
         <w:br/>
-        <w:t xml:space="preserve">- </w:t>
-      </w:r>
-      <w:proofErr w:type="spellStart"/>
-      <w:r>
-        <w:t>MicroUSB</w:t>
-      </w:r>
-      <w:proofErr w:type="spellEnd"/>
-      <w:r>
-        <w:t xml:space="preserve"> naar USBA kabel</w:t>
+        <w:t>- MicroUSB naar USBA kabel</w:t>
       </w:r>
     </w:p>
     <w:p>
@@ -1002,15 +961,7 @@
         </w:numPr>
       </w:pPr>
       <w:r>
-        <w:t xml:space="preserve">Sluit de ESP32 aan op de laptop met de </w:t>
-      </w:r>
-      <w:proofErr w:type="spellStart"/>
-      <w:r>
-        <w:t>MicroUSB</w:t>
-      </w:r>
-      <w:proofErr w:type="spellEnd"/>
-      <w:r>
-        <w:t xml:space="preserve"> naar USBA kabel.</w:t>
+        <w:t>Sluit de ESP32 aan op de laptop met de MicroUSB naar USBA kabel.</w:t>
       </w:r>
     </w:p>
     <w:p>
@@ -1022,13 +973,8 @@
         </w:numPr>
       </w:pPr>
       <w:r>
-        <w:t xml:space="preserve">Open de verwezen code en download de benodigde </w:t>
-      </w:r>
-      <w:proofErr w:type="spellStart"/>
-      <w:r>
-        <w:t>libraries</w:t>
-      </w:r>
-      <w:proofErr w:type="spellEnd"/>
+        <w:t>Open de verwezen code en download de benodigde libraries</w:t>
+      </w:r>
     </w:p>
     <w:p>
       <w:pPr>
@@ -1039,15 +985,7 @@
         </w:numPr>
       </w:pPr>
       <w:r>
-        <w:t>Upload de code naar de ESP32 en open de “</w:t>
-      </w:r>
-      <w:proofErr w:type="spellStart"/>
-      <w:r>
-        <w:t>Serial</w:t>
-      </w:r>
-      <w:proofErr w:type="spellEnd"/>
-      <w:r>
-        <w:t xml:space="preserve"> monitor”</w:t>
+        <w:t>Upload de code naar de ESP32 en open de “Serial monitor”</w:t>
       </w:r>
     </w:p>
     <w:p>
@@ -1325,15 +1263,7 @@
       </w:r>
       <w:r>
         <w:br/>
-        <w:t xml:space="preserve">- Laptop met een manier om code up te </w:t>
-      </w:r>
-      <w:proofErr w:type="spellStart"/>
-      <w:r>
-        <w:t>loaden</w:t>
-      </w:r>
-      <w:proofErr w:type="spellEnd"/>
-      <w:r>
-        <w:t xml:space="preserve"> naar de ESP32</w:t>
+        <w:t>- Laptop met een manier om code up te loaden naar de ESP32</w:t>
       </w:r>
       <w:r>
         <w:br/>
@@ -1342,126 +1272,43 @@
       <w:r>
         <w:t xml:space="preserve">bijv. </w:t>
       </w:r>
-      <w:proofErr w:type="spellStart"/>
-      <w:r>
-        <w:t>Arduino</w:t>
-      </w:r>
-      <w:proofErr w:type="spellEnd"/>
-      <w:r>
-        <w:t xml:space="preserve"> R3)</w:t>
+      <w:r>
+        <w:t>Arduino R3)</w:t>
       </w:r>
       <w:r>
         <w:br/>
-        <w:t xml:space="preserve">- </w:t>
-      </w:r>
-      <w:proofErr w:type="spellStart"/>
-      <w:r>
-        <w:t>Unity</w:t>
-      </w:r>
-      <w:proofErr w:type="spellEnd"/>
-      <w:r>
-        <w:t xml:space="preserve"> </w:t>
-      </w:r>
-      <w:proofErr w:type="spellStart"/>
-      <w:r>
-        <w:t>executable</w:t>
-      </w:r>
-      <w:proofErr w:type="spellEnd"/>
-      <w:r>
-        <w:t xml:space="preserve"> (zie </w:t>
+        <w:t xml:space="preserve">- Unity executable (zie </w:t>
       </w:r>
       <w:r>
         <w:rPr>
           <w:color w:val="00B0F0"/>
         </w:rPr>
-        <w:t>Project-5-6---</w:t>
-      </w:r>
-      <w:proofErr w:type="spellStart"/>
+        <w:t>Project-5-6---Floating-Farm\Opleverset\Code\GUI\D3D12</w:t>
+      </w:r>
       <w:r>
         <w:rPr>
           <w:color w:val="00B0F0"/>
         </w:rPr>
-        <w:t>Floating</w:t>
-      </w:r>
-      <w:proofErr w:type="spellEnd"/>
+        <w:t>\FloatingFarm.exe</w:t>
+      </w:r>
+      <w:r>
+        <w:t>)</w:t>
+      </w:r>
+      <w:r>
+        <w:br/>
+        <w:t xml:space="preserve">- ESP32 code (zie </w:t>
+      </w:r>
       <w:r>
         <w:rPr>
           <w:color w:val="00B0F0"/>
         </w:rPr>
-        <w:t>-Farm\</w:t>
-      </w:r>
-      <w:proofErr w:type="spellStart"/>
+        <w:t>Project-5-6---Floating-Farm\Opleverset\Code\ESP32</w:t>
+      </w:r>
       <w:r>
         <w:rPr>
           <w:color w:val="00B0F0"/>
         </w:rPr>
-        <w:t>Opleverset</w:t>
-      </w:r>
-      <w:proofErr w:type="spellEnd"/>
-      <w:r>
-        <w:rPr>
-          <w:color w:val="00B0F0"/>
-        </w:rPr>
-        <w:t>\Code\GUI</w:t>
-      </w:r>
-      <w:r>
-        <w:rPr>
-          <w:color w:val="00B0F0"/>
-        </w:rPr>
-        <w:t>\</w:t>
-      </w:r>
-      <w:r>
-        <w:rPr>
-          <w:color w:val="00B0F0"/>
-        </w:rPr>
-        <w:t>…</w:t>
-      </w:r>
-      <w:r>
-        <w:t>)</w:t>
-      </w:r>
-      <w:r>
-        <w:br/>
-        <w:t xml:space="preserve">- ESP32 code (zie </w:t>
-      </w:r>
-      <w:r>
-        <w:rPr>
-          <w:color w:val="00B0F0"/>
-        </w:rPr>
-        <w:t>Project-5-6---</w:t>
-      </w:r>
-      <w:proofErr w:type="spellStart"/>
-      <w:r>
-        <w:rPr>
-          <w:color w:val="00B0F0"/>
-        </w:rPr>
-        <w:t>Floating</w:t>
-      </w:r>
-      <w:proofErr w:type="spellEnd"/>
-      <w:r>
-        <w:rPr>
-          <w:color w:val="00B0F0"/>
-        </w:rPr>
-        <w:t>-Farm\</w:t>
-      </w:r>
-      <w:proofErr w:type="spellStart"/>
-      <w:r>
-        <w:rPr>
-          <w:color w:val="00B0F0"/>
-        </w:rPr>
-        <w:t>Opleverset</w:t>
-      </w:r>
-      <w:proofErr w:type="spellEnd"/>
-      <w:r>
-        <w:rPr>
-          <w:color w:val="00B0F0"/>
-        </w:rPr>
-        <w:t>\Code\ESP32</w:t>
-      </w:r>
-      <w:r>
-        <w:rPr>
-          <w:color w:val="00B0F0"/>
-        </w:rPr>
-        <w:t>\…</w:t>
+        <w:t>\src\main.cpp</w:t>
       </w:r>
       <w:r>
         <w:t>)</w:t>
@@ -1500,15 +1347,7 @@
         </w:numPr>
       </w:pPr>
       <w:r>
-        <w:t xml:space="preserve">Sluit de ESP32 aan op de laptop met de </w:t>
-      </w:r>
-      <w:proofErr w:type="spellStart"/>
-      <w:r>
-        <w:t>MicroUSB</w:t>
-      </w:r>
-      <w:proofErr w:type="spellEnd"/>
-      <w:r>
-        <w:t xml:space="preserve"> naar USBA kabel.</w:t>
+        <w:t>Sluit de ESP32 aan op de laptop met de MicroUSB naar USBA kabel.</w:t>
       </w:r>
     </w:p>
     <w:p>
@@ -1520,13 +1359,8 @@
         </w:numPr>
       </w:pPr>
       <w:r>
-        <w:t xml:space="preserve">Open de verwezen code en download de benodigde </w:t>
-      </w:r>
-      <w:proofErr w:type="spellStart"/>
-      <w:r>
-        <w:t>libraries</w:t>
-      </w:r>
-      <w:proofErr w:type="spellEnd"/>
+        <w:t>Open de verwezen code en download de benodigde libraries</w:t>
+      </w:r>
     </w:p>
     <w:p>
       <w:pPr>
@@ -1552,21 +1386,8 @@
         </w:numPr>
       </w:pPr>
       <w:r>
-        <w:t xml:space="preserve">Open de </w:t>
-      </w:r>
-      <w:proofErr w:type="spellStart"/>
-      <w:r>
-        <w:t>Unity</w:t>
-      </w:r>
-      <w:proofErr w:type="spellEnd"/>
-      <w:r>
-        <w:t xml:space="preserve"> </w:t>
-      </w:r>
-      <w:proofErr w:type="spellStart"/>
-      <w:r>
-        <w:t>executable</w:t>
-      </w:r>
-      <w:proofErr w:type="spellEnd"/>
+        <w:t>Open de Unity executable</w:t>
+      </w:r>
     </w:p>
     <w:p>
       <w:pPr>
@@ -1658,15 +1479,7 @@
           </w:tcPr>
           <w:p>
             <w:r>
-              <w:t xml:space="preserve">De </w:t>
-            </w:r>
-            <w:proofErr w:type="spellStart"/>
-            <w:r>
-              <w:t>Unity</w:t>
-            </w:r>
-            <w:proofErr w:type="spellEnd"/>
-            <w:r>
-              <w:t xml:space="preserve"> interface bootst te positie van de MPU-6050 na met behulp van een 3D model</w:t>
+              <w:t>De Unity interface bootst te positie van de MPU-6050 na met behulp van een 3D model</w:t>
             </w:r>
             <w:r>
               <w:t>.</w:t>
@@ -1689,15 +1502,7 @@
     </w:p>
     <w:p>
       <w:r>
-        <w:t xml:space="preserve">De </w:t>
-      </w:r>
-      <w:proofErr w:type="spellStart"/>
-      <w:r>
-        <w:t>Unity</w:t>
-      </w:r>
-      <w:proofErr w:type="spellEnd"/>
-      <w:r>
-        <w:t xml:space="preserve"> interface is accuraat in de</w:t>
+        <w:t>De Unity interface is accuraat in de</w:t>
       </w:r>
       <w:r>
         <w:t xml:space="preserve"> nabootsing en de positie komt overeen met de lezingen van de Accelerometer. Deze lezingen blijven accuraat voor op z’n minst 5 minuten met maximaal 3 graden afwijking.</w:t>
@@ -1777,15 +1582,7 @@
     </w:p>
     <w:p>
       <w:r>
-        <w:t xml:space="preserve">Test succesvol, de </w:t>
-      </w:r>
-      <w:proofErr w:type="spellStart"/>
-      <w:r>
-        <w:t>Unity</w:t>
-      </w:r>
-      <w:proofErr w:type="spellEnd"/>
-      <w:r>
-        <w:t xml:space="preserve"> Interface past zich correct aan</w:t>
+        <w:t>Test succesvol, de Unity Interface past zich correct aan</w:t>
       </w:r>
       <w:r>
         <w:t xml:space="preserve"> in relatie tot</w:t>
@@ -1826,14 +1623,9 @@
         <w:t xml:space="preserve"> </w:t>
       </w:r>
       <w:r>
-        <w:t xml:space="preserve">Aansturen van de waterpompen met </w:t>
-      </w:r>
-      <w:proofErr w:type="spellStart"/>
-      <w:r>
-        <w:t>Mosfets</w:t>
+        <w:t>Aansturen van de waterpompen met Mosfets</w:t>
       </w:r>
       <w:bookmarkEnd w:id="4"/>
-      <w:proofErr w:type="spellEnd"/>
     </w:p>
     <w:p>
       <w:pPr>
@@ -1871,7 +1663,7 @@
           <w:noProof/>
         </w:rPr>
         <w:drawing>
-          <wp:anchor distT="0" distB="0" distL="114300" distR="114300" simplePos="0" relativeHeight="251658240" behindDoc="0" locked="0" layoutInCell="1" allowOverlap="1" wp14:anchorId="1C9F4511" wp14:editId="7C585D73">
+          <wp:anchor distT="0" distB="0" distL="114300" distR="114300" simplePos="0" relativeHeight="251658240" behindDoc="0" locked="0" layoutInCell="1" allowOverlap="1" wp14:anchorId="1C9F4511" wp14:editId="636B644C">
             <wp:simplePos x="0" y="0"/>
             <wp:positionH relativeFrom="page">
               <wp:align>right</wp:align>
@@ -1938,27 +1730,11 @@
       </w:r>
       <w:r>
         <w:br/>
-        <w:t xml:space="preserve">- Laptop met een manier om code up te </w:t>
-      </w:r>
-      <w:proofErr w:type="spellStart"/>
-      <w:r>
-        <w:t>loaden</w:t>
-      </w:r>
-      <w:proofErr w:type="spellEnd"/>
-      <w:r>
-        <w:t xml:space="preserve"> naar de ESP32</w:t>
+        <w:t>- Laptop met een manier om code up te loaden naar de ESP32</w:t>
       </w:r>
       <w:r>
         <w:br/>
-        <w:t xml:space="preserve">- Een ESP32 of soortgelijke microcontroller (bijv. </w:t>
-      </w:r>
-      <w:proofErr w:type="spellStart"/>
-      <w:r>
-        <w:t>Arduino</w:t>
-      </w:r>
-      <w:proofErr w:type="spellEnd"/>
-      <w:r>
-        <w:t xml:space="preserve"> R3)</w:t>
+        <w:t>- Een ESP32 of soortgelijke microcontroller (bijv. Arduino R3)</w:t>
       </w:r>
       <w:r>
         <w:br/>
@@ -1968,41 +1744,19 @@
         <w:rPr>
           <w:color w:val="00B0F0"/>
         </w:rPr>
-        <w:t>Project-5-6---</w:t>
-      </w:r>
-      <w:proofErr w:type="spellStart"/>
+        <w:t>Project-5-6---Floating-Farm\Opleverset\Code\ESP3</w:t>
+      </w:r>
       <w:r>
         <w:rPr>
           <w:color w:val="00B0F0"/>
         </w:rPr>
-        <w:t>Floating</w:t>
-      </w:r>
-      <w:proofErr w:type="spellEnd"/>
+        <w:t>2\</w:t>
+      </w:r>
       <w:r>
         <w:rPr>
           <w:color w:val="00B0F0"/>
         </w:rPr>
-        <w:t>-Farm\</w:t>
-      </w:r>
-      <w:proofErr w:type="spellStart"/>
-      <w:r>
-        <w:rPr>
-          <w:color w:val="00B0F0"/>
-        </w:rPr>
-        <w:t>Opleverset</w:t>
-      </w:r>
-      <w:proofErr w:type="spellEnd"/>
-      <w:r>
-        <w:rPr>
-          <w:color w:val="00B0F0"/>
-        </w:rPr>
-        <w:t>\Code\ESP32</w:t>
-      </w:r>
-      <w:r>
-        <w:rPr>
-          <w:color w:val="00B0F0"/>
-        </w:rPr>
-        <w:t>\…</w:t>
+        <w:t>src\main.cpp</w:t>
       </w:r>
       <w:r>
         <w:t>)</w:t>
@@ -2017,13 +1771,8 @@
       </w:r>
       <w:r>
         <w:br/>
-        <w:t xml:space="preserve">- 4 </w:t>
-      </w:r>
-      <w:proofErr w:type="spellStart"/>
-      <w:r>
-        <w:t>Mosfets</w:t>
-      </w:r>
-      <w:proofErr w:type="spellEnd"/>
+        <w:t>- 4 Mosfets</w:t>
+      </w:r>
       <w:r>
         <w:br/>
         <w:t>- 10k Ohm weerstanden</w:t>
@@ -2046,15 +1795,7 @@
         </w:numPr>
       </w:pPr>
       <w:r>
-        <w:t xml:space="preserve">Sluit de </w:t>
-      </w:r>
-      <w:proofErr w:type="spellStart"/>
-      <w:r>
-        <w:t>Mosfet</w:t>
-      </w:r>
-      <w:proofErr w:type="spellEnd"/>
-      <w:r>
-        <w:t xml:space="preserve"> schakelingen aan op de ESP32 zoals op het elektrische schema</w:t>
+        <w:t>Sluit de Mosfet schakelingen aan op de ESP32 zoals op het elektrische schema</w:t>
       </w:r>
     </w:p>
     <w:p>
@@ -2066,15 +1807,7 @@
         </w:numPr>
       </w:pPr>
       <w:r>
-        <w:t xml:space="preserve">Sluit de ESP32 aan op de laptop met de </w:t>
-      </w:r>
-      <w:proofErr w:type="spellStart"/>
-      <w:r>
-        <w:t>MicroUSB</w:t>
-      </w:r>
-      <w:proofErr w:type="spellEnd"/>
-      <w:r>
-        <w:t xml:space="preserve"> naar USBA kabel</w:t>
+        <w:t>Sluit de ESP32 aan op de laptop met de MicroUSB naar USBA kabel</w:t>
       </w:r>
     </w:p>
     <w:p>
@@ -2086,29 +1819,13 @@
         </w:numPr>
       </w:pPr>
       <w:r>
-        <w:t>Sluit de “</w:t>
-      </w:r>
-      <w:proofErr w:type="spellStart"/>
-      <w:r>
-        <w:t>Ground</w:t>
-      </w:r>
-      <w:proofErr w:type="spellEnd"/>
-      <w:r>
-        <w:t xml:space="preserve">” selectief </w:t>
+        <w:t xml:space="preserve">Sluit de “Ground” selectief </w:t>
       </w:r>
       <w:r>
         <w:t xml:space="preserve">aan </w:t>
       </w:r>
       <w:r>
-        <w:t xml:space="preserve">op de juiste </w:t>
-      </w:r>
-      <w:proofErr w:type="spellStart"/>
-      <w:r>
-        <w:t>Mosfet</w:t>
-      </w:r>
-      <w:proofErr w:type="spellEnd"/>
-      <w:r>
-        <w:t xml:space="preserve"> (middelste pin)</w:t>
+        <w:t>op de juiste Mosfet (middelste pin)</w:t>
       </w:r>
       <w:r>
         <w:t xml:space="preserve"> </w:t>
@@ -2174,15 +1891,7 @@
           </w:tcPr>
           <w:p>
             <w:r>
-              <w:t xml:space="preserve">De </w:t>
-            </w:r>
-            <w:proofErr w:type="spellStart"/>
-            <w:r>
-              <w:t>Mosfets</w:t>
-            </w:r>
-            <w:proofErr w:type="spellEnd"/>
-            <w:r>
-              <w:t xml:space="preserve"> worden correct aangestuurd, en de pompen gaan aan wanneer er stroom op de Gate gezet word (linker pin). </w:t>
+              <w:t xml:space="preserve">De Mosfets worden correct aangestuurd, en de pompen gaan aan wanneer er stroom op de Gate gezet word (linker pin). </w:t>
             </w:r>
           </w:p>
         </w:tc>
@@ -2204,15 +1913,7 @@
         <w:t xml:space="preserve">ESP32 </w:t>
       </w:r>
       <w:r>
-        <w:t xml:space="preserve">uitstuurt, door middel van de </w:t>
-      </w:r>
-      <w:proofErr w:type="spellStart"/>
-      <w:r>
-        <w:t>Mosfets</w:t>
-      </w:r>
-      <w:proofErr w:type="spellEnd"/>
-      <w:r>
-        <w:t xml:space="preserve">. </w:t>
+        <w:t xml:space="preserve">uitstuurt, door middel van de Mosfets. </w:t>
       </w:r>
     </w:p>
     <w:p>
@@ -2272,15 +1973,7 @@
           </w:tcPr>
           <w:p>
             <w:r>
-              <w:t xml:space="preserve">De </w:t>
-            </w:r>
-            <w:proofErr w:type="spellStart"/>
-            <w:r>
-              <w:t>Mosfets</w:t>
-            </w:r>
-            <w:proofErr w:type="spellEnd"/>
-            <w:r>
-              <w:t xml:space="preserve"> geven niet 100% van de stroom door, maar genoeg. Motoren gaan aan, en draaien snel genoeg.</w:t>
+              <w:t>De Mosfets geven niet 100% van de stroom door, maar genoeg. Motoren gaan aan, en draaien snel genoeg.</w:t>
             </w:r>
           </w:p>
         </w:tc>
@@ -2344,15 +2037,7 @@
         <w:t xml:space="preserve">en een verandering is nodig, </w:t>
       </w:r>
       <w:r>
-        <w:t xml:space="preserve">moeten de pompen in beweging komen om de </w:t>
-      </w:r>
-      <w:proofErr w:type="spellStart"/>
-      <w:r>
-        <w:t>Floating</w:t>
-      </w:r>
-      <w:proofErr w:type="spellEnd"/>
-      <w:r>
-        <w:t xml:space="preserve"> Farm te stabiliseren. </w:t>
+        <w:t xml:space="preserve">moeten de pompen in beweging komen om de Floating Farm te stabiliseren. </w:t>
       </w:r>
     </w:p>
     <w:p>
@@ -2369,27 +2054,11 @@
       </w:r>
       <w:r>
         <w:br/>
-        <w:t xml:space="preserve">- Schaalmodel </w:t>
-      </w:r>
-      <w:proofErr w:type="spellStart"/>
-      <w:r>
-        <w:t>Floating</w:t>
-      </w:r>
-      <w:proofErr w:type="spellEnd"/>
-      <w:r>
-        <w:t xml:space="preserve"> Farm</w:t>
+        <w:t>- Schaalmodel Floating Farm</w:t>
       </w:r>
       <w:r>
         <w:br/>
-        <w:t xml:space="preserve">- Laptop met een manier om code up te </w:t>
-      </w:r>
-      <w:proofErr w:type="spellStart"/>
-      <w:r>
-        <w:t>loaden</w:t>
-      </w:r>
-      <w:proofErr w:type="spellEnd"/>
-      <w:r>
-        <w:t xml:space="preserve"> naar de ESP32</w:t>
+        <w:t>- Laptop met een manier om code up te loaden naar de ESP32</w:t>
       </w:r>
       <w:r>
         <w:br/>
@@ -2397,16 +2066,32 @@
       </w:r>
       <w:r>
         <w:br/>
-        <w:t xml:space="preserve">- MPU-6050 </w:t>
-      </w:r>
-      <w:proofErr w:type="spellStart"/>
-      <w:r>
-        <w:t>accelerometer</w:t>
-      </w:r>
-      <w:proofErr w:type="spellEnd"/>
+        <w:t>- MPU-6050 accelerometer</w:t>
+      </w:r>
       <w:r>
         <w:br/>
         <w:t>- ESP32 code</w:t>
+      </w:r>
+      <w:r>
+        <w:t xml:space="preserve"> (</w:t>
+      </w:r>
+      <w:r>
+        <w:rPr>
+          <w:color w:val="00B0F0"/>
+        </w:rPr>
+        <w:t>Project-5-6---Floating-Farm\Opleverset\Code\ESP3</w:t>
+      </w:r>
+      <w:r>
+        <w:rPr>
+          <w:color w:val="00B0F0"/>
+        </w:rPr>
+        <w:t>2\src\main.cpp</w:t>
+      </w:r>
+      <w:r>
+        <w:rPr>
+          <w:color w:val="00B0F0"/>
+        </w:rPr>
+        <w:t>)</w:t>
       </w:r>
       <w:r>
         <w:br/>
@@ -2444,15 +2129,7 @@
         </w:numPr>
       </w:pPr>
       <w:r>
-        <w:t xml:space="preserve">Sluit de Accelerometer en waterpompen met de </w:t>
-      </w:r>
-      <w:proofErr w:type="spellStart"/>
-      <w:r>
-        <w:t>Mosfets</w:t>
-      </w:r>
-      <w:proofErr w:type="spellEnd"/>
-      <w:r>
-        <w:t xml:space="preserve"> aan op de ESP volgens het elektrische schema. </w:t>
+        <w:t xml:space="preserve">Sluit de Accelerometer en waterpompen met de Mosfets aan op de ESP volgens het elektrische schema. </w:t>
       </w:r>
     </w:p>
     <w:p>
@@ -2476,15 +2153,7 @@
         </w:numPr>
       </w:pPr>
       <w:r>
-        <w:t xml:space="preserve">Open de verwezen code en download de benodigde </w:t>
-      </w:r>
-      <w:proofErr w:type="spellStart"/>
-      <w:r>
-        <w:t>libraries</w:t>
-      </w:r>
-      <w:proofErr w:type="spellEnd"/>
-      <w:r>
-        <w:t xml:space="preserve"> </w:t>
+        <w:t xml:space="preserve">Open de verwezen code en download de benodigde libraries </w:t>
       </w:r>
     </w:p>
     <w:p>
@@ -2571,15 +2240,7 @@
           </w:tcPr>
           <w:p>
             <w:r>
-              <w:t xml:space="preserve">Het stabilisatiesysteem stabiliseert de </w:t>
-            </w:r>
-            <w:proofErr w:type="spellStart"/>
-            <w:r>
-              <w:t>floating</w:t>
-            </w:r>
-            <w:proofErr w:type="spellEnd"/>
-            <w:r>
-              <w:t xml:space="preserve"> farm, maar niet binnen 10 graden afwijking.</w:t>
+              <w:t>Het stabilisatiesysteem stabiliseert de floating farm, maar niet binnen 10 graden afwijking.</w:t>
             </w:r>
           </w:p>
         </w:tc>
@@ -2738,15 +2399,7 @@
         </w:numPr>
       </w:pPr>
       <w:r>
-        <w:t xml:space="preserve">Schaalmodel van de </w:t>
-      </w:r>
-      <w:proofErr w:type="spellStart"/>
-      <w:r>
-        <w:t>floating</w:t>
-      </w:r>
-      <w:proofErr w:type="spellEnd"/>
-      <w:r>
-        <w:t xml:space="preserve"> farm met 4 waterdichte ballasttanks</w:t>
+        <w:t>Schaalmodel van de floating farm met 4 waterdichte ballasttanks</w:t>
       </w:r>
     </w:p>
     <w:p>

</xml_diff>